<commit_message>
Actualizacion de gestoria en manuales y procedimientos
</commit_message>
<xml_diff>
--- a/manual-procedimientos-machote/Indice de procedimientos (00000003).docx
+++ b/manual-procedimientos-machote/Indice de procedimientos (00000003).docx
@@ -724,21 +724,17 @@
           <w:sz w:val="80"/>
           <w:szCs w:val="80"/>
         </w:rPr>
-        <w:t>Procedimiento para la recepción de auto-tanques, descarga de productos inflamables y combustibles a tanques de almacenamiento.</w:t>
+        <w:t xml:space="preserve">Procedimiento para la recepción de auto-tanques, descarga de productos </w:t>
       </w:r>
-    </w:p>
-    <w:p>
-      <w:pPr>
-        <w:widowControl/>
-        <w:spacing w:before="240" w:after="160" w:line="360" w:lineRule="auto"/>
-        <w:contextualSpacing/>
-        <w:jc w:val="center"/>
+      <w:r>
         <w:rPr>
           <w:rFonts w:asciiTheme="majorHAnsi" w:hAnsiTheme="majorHAnsi"/>
           <w:sz w:val="80"/>
           <w:szCs w:val="80"/>
         </w:rPr>
-      </w:pPr>
+        <w:lastRenderedPageBreak/>
+        <w:t>inflamables y combustibles a tanques de almacenamiento.</w:t>
+      </w:r>
     </w:p>
     <w:p>
       <w:pPr>
@@ -752,12 +748,25 @@
           <w:szCs w:val="80"/>
         </w:rPr>
       </w:pPr>
-      <w:r>
+    </w:p>
+    <w:p>
+      <w:pPr>
+        <w:widowControl/>
+        <w:spacing w:before="240" w:after="160" w:line="360" w:lineRule="auto"/>
+        <w:contextualSpacing/>
+        <w:jc w:val="center"/>
         <w:rPr>
           <w:rFonts w:asciiTheme="majorHAnsi" w:hAnsiTheme="majorHAnsi"/>
           <w:sz w:val="80"/>
           <w:szCs w:val="80"/>
         </w:rPr>
+      </w:pPr>
+      <w:r>
+        <w:rPr>
+          <w:rFonts w:asciiTheme="majorHAnsi" w:hAnsiTheme="majorHAnsi"/>
+          <w:sz w:val="80"/>
+          <w:szCs w:val="80"/>
+        </w:rPr>
         <w:t>PO-02</w:t>
       </w:r>
     </w:p>
@@ -779,6 +788,7 @@
           <w:sz w:val="80"/>
           <w:szCs w:val="80"/>
         </w:rPr>
+        <w:lastRenderedPageBreak/>
         <w:t>Procedimiento de productos inflamables y combustibles a vehículos</w:t>
       </w:r>
       <w:r>
@@ -846,6 +856,7 @@
           <w:sz w:val="80"/>
           <w:szCs w:val="80"/>
         </w:rPr>
+        <w:lastRenderedPageBreak/>
         <w:t>PO-03</w:t>
       </w:r>
     </w:p>
@@ -1018,21 +1029,17 @@
           <w:sz w:val="80"/>
           <w:szCs w:val="80"/>
         </w:rPr>
-        <w:t>Procedimiento de etiquetado, bloqueo y candadeo para la interrupción de líneas eléctricas.</w:t>
+        <w:t xml:space="preserve">Procedimiento de etiquetado, bloqueo y candadeo para la </w:t>
       </w:r>
-    </w:p>
-    <w:p>
-      <w:pPr>
-        <w:widowControl/>
-        <w:spacing w:before="240" w:after="160" w:line="360" w:lineRule="auto"/>
-        <w:contextualSpacing/>
-        <w:jc w:val="center"/>
+      <w:r>
         <w:rPr>
           <w:rFonts w:asciiTheme="majorHAnsi" w:hAnsiTheme="majorHAnsi"/>
           <w:sz w:val="80"/>
           <w:szCs w:val="80"/>
         </w:rPr>
-      </w:pPr>
+        <w:lastRenderedPageBreak/>
+        <w:t>interrupción de líneas eléctricas.</w:t>
+      </w:r>
     </w:p>
     <w:p>
       <w:pPr>
@@ -1046,12 +1053,25 @@
           <w:szCs w:val="80"/>
         </w:rPr>
       </w:pPr>
-      <w:r>
+    </w:p>
+    <w:p>
+      <w:pPr>
+        <w:widowControl/>
+        <w:spacing w:before="240" w:after="160" w:line="360" w:lineRule="auto"/>
+        <w:contextualSpacing/>
+        <w:jc w:val="center"/>
         <w:rPr>
           <w:rFonts w:asciiTheme="majorHAnsi" w:hAnsiTheme="majorHAnsi"/>
           <w:sz w:val="80"/>
           <w:szCs w:val="80"/>
         </w:rPr>
+      </w:pPr>
+      <w:r>
+        <w:rPr>
+          <w:rFonts w:asciiTheme="majorHAnsi" w:hAnsiTheme="majorHAnsi"/>
+          <w:sz w:val="80"/>
+          <w:szCs w:val="80"/>
+        </w:rPr>
         <w:t>PO-06</w:t>
       </w:r>
     </w:p>
@@ -1073,39 +1093,48 @@
           <w:sz w:val="80"/>
           <w:szCs w:val="80"/>
         </w:rPr>
-        <w:t>Procedimiento para el etiquetado, bloqueo y candadeo para la interrupción de líneas de producto.</w:t>
+        <w:t xml:space="preserve">Procedimiento para el etiquetado, bloqueo y </w:t>
       </w:r>
-    </w:p>
-    <w:p>
-      <w:pPr>
-        <w:widowControl/>
-        <w:spacing w:before="240" w:after="160" w:line="360" w:lineRule="auto"/>
-        <w:contextualSpacing/>
+      <w:r>
         <w:rPr>
           <w:rFonts w:asciiTheme="majorHAnsi" w:hAnsiTheme="majorHAnsi"/>
           <w:sz w:val="80"/>
           <w:szCs w:val="80"/>
         </w:rPr>
-      </w:pPr>
+        <w:lastRenderedPageBreak/>
+        <w:t>candadeo para la interrupción de líneas de producto.</w:t>
+      </w:r>
     </w:p>
     <w:p>
       <w:pPr>
         <w:widowControl/>
         <w:spacing w:before="240" w:after="160" w:line="360" w:lineRule="auto"/>
         <w:contextualSpacing/>
-        <w:jc w:val="center"/>
         <w:rPr>
           <w:rFonts w:asciiTheme="majorHAnsi" w:hAnsiTheme="majorHAnsi"/>
           <w:sz w:val="80"/>
           <w:szCs w:val="80"/>
         </w:rPr>
       </w:pPr>
-      <w:r>
+    </w:p>
+    <w:p>
+      <w:pPr>
+        <w:widowControl/>
+        <w:spacing w:before="240" w:after="160" w:line="360" w:lineRule="auto"/>
+        <w:contextualSpacing/>
+        <w:jc w:val="center"/>
         <w:rPr>
           <w:rFonts w:asciiTheme="majorHAnsi" w:hAnsiTheme="majorHAnsi"/>
           <w:sz w:val="80"/>
           <w:szCs w:val="80"/>
         </w:rPr>
+      </w:pPr>
+      <w:r>
+        <w:rPr>
+          <w:rFonts w:asciiTheme="majorHAnsi" w:hAnsiTheme="majorHAnsi"/>
+          <w:sz w:val="80"/>
+          <w:szCs w:val="80"/>
+        </w:rPr>
         <w:t>PO-07</w:t>
       </w:r>
     </w:p>
@@ -1127,6 +1156,7 @@
           <w:sz w:val="80"/>
           <w:szCs w:val="80"/>
         </w:rPr>
+        <w:lastRenderedPageBreak/>
         <w:t>Procedimiento de trabajos peligrosos que generen ignición (soldaduras, chispas y/o flama abierta).</w:t>
       </w:r>
     </w:p>
@@ -1174,6 +1204,7 @@
           <w:sz w:val="80"/>
           <w:szCs w:val="80"/>
         </w:rPr>
+        <w:lastRenderedPageBreak/>
         <w:t>PO-08</w:t>
       </w:r>
     </w:p>
@@ -1625,8 +1656,8 @@
       <w:tblLook w:val="04A0" w:firstRow="1" w:lastRow="0" w:firstColumn="1" w:lastColumn="0" w:noHBand="0" w:noVBand="1"/>
     </w:tblPr>
     <w:tblGrid>
-      <w:gridCol w:w="7955"/>
-      <w:gridCol w:w="2019"/>
+      <w:gridCol w:w="5812"/>
+      <w:gridCol w:w="4162"/>
     </w:tblGrid>
     <w:tr>
       <w:trPr>
@@ -1635,7 +1666,7 @@
       </w:trPr>
       <w:tc>
         <w:tcPr>
-          <w:tcW w:w="8731" w:type="dxa"/>
+          <w:tcW w:w="5812" w:type="dxa"/>
         </w:tcPr>
         <w:p>
           <w:pPr>
@@ -1670,17 +1701,6 @@
               <w:lang w:val="es-MX" w:eastAsia="es-MX"/>
             </w:rPr>
           </w:pPr>
-          <w:r>
-            <w:rPr>
-              <w:rFonts w:ascii="Cambria" w:eastAsia="Hei" w:hAnsi="Cambria" w:cs="Arial"/>
-              <w:b/>
-              <w:noProof/>
-              <w:sz w:val="28"/>
-              <w:highlight w:val="yellow"/>
-              <w:lang w:val="es-MX" w:eastAsia="es-MX"/>
-            </w:rPr>
-            <w:t>11/09/2026</w:t>
-          </w:r>
           <w:r>
             <w:rPr>
               <w:rFonts w:ascii="Cambria" w:eastAsia="Hei" w:hAnsi="Cambria" w:cs="Arial"/>
@@ -1811,6 +1831,7 @@
               <w:b/>
               <w:sz w:val="36"/>
               <w:szCs w:val="36"/>
+              <w:highlight w:val="yellow"/>
             </w:rPr>
             <w:t>.</w:t>
           </w:r>
@@ -1818,13 +1839,75 @@
       </w:tc>
       <w:tc>
         <w:tcPr>
-          <w:tcW w:w="1243" w:type="dxa"/>
+          <w:tcW w:w="4162" w:type="dxa"/>
         </w:tcPr>
         <w:p>
           <w:pPr>
             <w:pStyle w:val="Encabezado"/>
             <w:ind w:left="708"/>
-            <w:jc w:val="both"/>
+            <w:jc w:val="center"/>
+            <w:rPr>
+              <w:rFonts w:eastAsiaTheme="majorEastAsia"/>
+              <w:b/>
+              <w:bCs/>
+              <w:color w:val="000000" w:themeColor="text1"/>
+              <w:sz w:val="36"/>
+              <w:szCs w:val="36"/>
+              <w:highlight w:val="yellow"/>
+            </w:rPr>
+          </w:pPr>
+        </w:p>
+        <w:p>
+          <w:pPr>
+            <w:pStyle w:val="Encabezado"/>
+            <w:ind w:left="708"/>
+            <w:jc w:val="center"/>
+            <w:rPr>
+              <w:rFonts w:eastAsiaTheme="majorEastAsia"/>
+              <w:b/>
+              <w:bCs/>
+              <w:color w:val="000000" w:themeColor="text1"/>
+              <w:sz w:val="36"/>
+              <w:szCs w:val="36"/>
+              <w:highlight w:val="yellow"/>
+            </w:rPr>
+          </w:pPr>
+        </w:p>
+        <w:p>
+          <w:pPr>
+            <w:pStyle w:val="Encabezado"/>
+            <w:ind w:left="708"/>
+            <w:jc w:val="center"/>
+            <w:rPr>
+              <w:rFonts w:eastAsiaTheme="majorEastAsia"/>
+              <w:b/>
+              <w:bCs/>
+              <w:color w:val="000000" w:themeColor="text1"/>
+              <w:sz w:val="36"/>
+              <w:szCs w:val="36"/>
+              <w:highlight w:val="yellow"/>
+            </w:rPr>
+          </w:pPr>
+        </w:p>
+        <w:p>
+          <w:pPr>
+            <w:pStyle w:val="Encabezado"/>
+            <w:rPr>
+              <w:rFonts w:eastAsiaTheme="majorEastAsia"/>
+              <w:b/>
+              <w:bCs/>
+              <w:color w:val="000000" w:themeColor="text1"/>
+              <w:sz w:val="36"/>
+              <w:szCs w:val="36"/>
+              <w:highlight w:val="yellow"/>
+            </w:rPr>
+          </w:pPr>
+        </w:p>
+        <w:p>
+          <w:pPr>
+            <w:pStyle w:val="Encabezado"/>
+            <w:ind w:left="708"/>
+            <w:jc w:val="center"/>
             <w:rPr>
               <w:rFonts w:eastAsiaTheme="majorEastAsia"/>
               <w:b/>
@@ -1843,6 +1926,7 @@
               <w:sz w:val="36"/>
               <w:szCs w:val="36"/>
               <w:highlight w:val="yellow"/>
+              <w:u w:val="single"/>
             </w:rPr>
             <w:t>LOGO</w:t>
           </w:r>
@@ -1932,7 +2016,7 @@
         <v:path o:extrusionok="f" gradientshapeok="t" o:connecttype="rect"/>
         <o:lock v:ext="edit" aspectratio="t"/>
       </v:shapetype>
-      <v:shape id="_x0000_i1029" type="#_x0000_t75" style="width:19.5pt;height:19.5pt" o:bullet="t">
+      <v:shape id="_x0000_i1034" type="#_x0000_t75" style="width:19.5pt;height:19.5pt" o:bullet="t">
         <v:imagedata r:id="rId1" o:title=""/>
       </v:shape>
     </w:pict>

</xml_diff>